<commit_message>
HW3: retrieval results, annotations, metrics
</commit_message>
<xml_diff>
--- a/reports/hw03/Wang_HW3.docx
+++ b/reports/hw03/Wang_HW3.docx
@@ -45,7 +45,7 @@
         </w:rPr>
         <w:t xml:space="preserve">Repository: </w:t>
       </w:r>
-      <w:hyperlink w:history="1" r:id="rIddpgecghh61ipycwwn6cid">
+      <w:hyperlink w:history="1" r:id="rIdemuobxtxh9q1uzeur0gb4">
         <w:r>
           <w:rPr>
             <w:rStyle w:val="Hyperlink"/>
@@ -5411,14 +5411,10 @@
             <w:r>
               <w:rPr>
                 <w:rFonts w:ascii="Calibri" w:cs="Calibri" w:eastAsia="Calibri" w:hAnsi="Calibri"/>
-                <w:b/>
-                <w:bCs/>
-                <w:sz w:val="18"/>
-                <w:szCs w:val="18"/>
-                <w:highlight w:val="yellow"/>
-                <w:highlightCs w:val="yellow"/>
-              </w:rPr>
-              <w:t xml:space="preserve">[TODO: from make fetch-corpus: n files]</w:t>
+                <w:sz w:val="18"/>
+                <w:szCs w:val="18"/>
+              </w:rPr>
+              <w:t xml:space="preserve">90 (89 FDA announcements + 21 CFR Part 7)</w:t>
             </w:r>
           </w:p>
         </w:tc>
@@ -5471,14 +5467,10 @@
             <w:r>
               <w:rPr>
                 <w:rFonts w:ascii="Calibri" w:cs="Calibri" w:eastAsia="Calibri" w:hAnsi="Calibri"/>
-                <w:b/>
-                <w:bCs/>
-                <w:sz w:val="18"/>
-                <w:szCs w:val="18"/>
-                <w:highlight w:val="yellow"/>
-                <w:highlightCs w:val="yellow"/>
-              </w:rPr>
-              <w:t xml:space="preserve">[TODO: total bytes, must be ≥ 200,000]</w:t>
+                <w:sz w:val="18"/>
+                <w:szCs w:val="18"/>
+              </w:rPr>
+              <w:t xml:space="preserve">274,233 bytes</w:t>
             </w:r>
           </w:p>
         </w:tc>
@@ -5534,19 +5526,7 @@
                 <w:sz w:val="18"/>
                 <w:szCs w:val="18"/>
               </w:rPr>
-              <w:t xml:space="preserve">ecfr_21cfr_part7.txt </w:t>
-            </w:r>
-            <w:r>
-              <w:rPr>
-                <w:rFonts w:ascii="Calibri" w:cs="Calibri" w:eastAsia="Calibri" w:hAnsi="Calibri"/>
-                <w:b/>
-                <w:bCs/>
-                <w:sz w:val="18"/>
-                <w:szCs w:val="18"/>
-                <w:highlight w:val="yellow"/>
-                <w:highlightCs w:val="yellow"/>
-              </w:rPr>
-              <w:t xml:space="preserve">[TODO: bytes]</w:t>
+              <w:t xml:space="preserve">ecfr_21cfr_part7.txt, 37,649 bytes</w:t>
             </w:r>
           </w:p>
         </w:tc>
@@ -5666,15 +5646,11 @@
       </w:r>
       <w:r>
         <w:rPr>
-          <w:rFonts w:ascii="Calibri" w:cs="Calibri" w:eastAsia="Calibri" w:hAnsi="Calibri"/>
-          <w:b/>
-          <w:bCs/>
-          <w:sz w:val="21"/>
-          <w:szCs w:val="21"/>
-          <w:highlight w:val="yellow"/>
-          <w:highlightCs w:val="yellow"/>
-        </w:rPr>
-        <w:t xml:space="preserve">[TODO: commit hash]</w:t>
+          <w:rFonts w:ascii="Consolas" w:cs="Consolas" w:eastAsia="Consolas" w:hAnsi="Consolas"/>
+          <w:sz w:val="19"/>
+          <w:szCs w:val="19"/>
+        </w:rPr>
+        <w:t xml:space="preserve">cb591c6</w:t>
       </w:r>
       <w:r>
         <w:rPr>
@@ -6256,23 +6232,6 @@
       <w:pPr>
         <w:spacing w:after="120"/>
       </w:pPr>
-    </w:p>
-    <w:p>
-      <w:pPr>
-        <w:spacing w:after="120" w:line="276"/>
-      </w:pPr>
-      <w:r>
-        <w:rPr>
-          <w:rFonts w:ascii="Calibri" w:cs="Calibri" w:eastAsia="Calibri" w:hAnsi="Calibri"/>
-          <w:b/>
-          <w:bCs/>
-          <w:sz w:val="21"/>
-          <w:szCs w:val="21"/>
-          <w:highlight w:val="yellow"/>
-          <w:highlightCs w:val="yellow"/>
-        </w:rPr>
-        <w:t xml:space="preserve">[TODO: If you change questions.yaml before committing it, update this table.]</w:t>
-      </w:r>
     </w:p>
     <w:p>
       <w:pPr>
@@ -9241,7 +9200,16 @@
               <w:right w:type="dxa" w:w="100"/>
             </w:tcMar>
           </w:tcPr>
-          <w:p/>
+          <w:p>
+            <w:r>
+              <w:rPr>
+                <w:rFonts w:ascii="Calibri" w:cs="Calibri" w:eastAsia="Calibri" w:hAnsi="Calibri"/>
+                <w:sz w:val="18"/>
+                <w:szCs w:val="18"/>
+              </w:rPr>
+              <w:t xml:space="preserve">413</w:t>
+            </w:r>
+          </w:p>
         </w:tc>
         <w:tc>
           <w:tcPr>
@@ -9259,7 +9227,16 @@
               <w:right w:type="dxa" w:w="100"/>
             </w:tcMar>
           </w:tcPr>
-          <w:p/>
+          <w:p>
+            <w:r>
+              <w:rPr>
+                <w:rFonts w:ascii="Calibri" w:cs="Calibri" w:eastAsia="Calibri" w:hAnsi="Calibri"/>
+                <w:sz w:val="18"/>
+                <w:szCs w:val="18"/>
+              </w:rPr>
+              <w:t xml:space="preserve">760.3</w:t>
+            </w:r>
+          </w:p>
         </w:tc>
         <w:tc>
           <w:tcPr>
@@ -9277,7 +9254,16 @@
               <w:right w:type="dxa" w:w="100"/>
             </w:tcMar>
           </w:tcPr>
-          <w:p/>
+          <w:p>
+            <w:r>
+              <w:rPr>
+                <w:rFonts w:ascii="Calibri" w:cs="Calibri" w:eastAsia="Calibri" w:hAnsi="Calibri"/>
+                <w:sz w:val="18"/>
+                <w:szCs w:val="18"/>
+              </w:rPr>
+              <w:t xml:space="preserve">0.7085</w:t>
+            </w:r>
+          </w:p>
         </w:tc>
         <w:tc>
           <w:tcPr>
@@ -9295,7 +9281,16 @@
               <w:right w:type="dxa" w:w="100"/>
             </w:tcMar>
           </w:tcPr>
-          <w:p/>
+          <w:p>
+            <w:r>
+              <w:rPr>
+                <w:rFonts w:ascii="Calibri" w:cs="Calibri" w:eastAsia="Calibri" w:hAnsi="Calibri"/>
+                <w:sz w:val="18"/>
+                <w:szCs w:val="18"/>
+              </w:rPr>
+              <w:t xml:space="preserve">0.6488</w:t>
+            </w:r>
+          </w:p>
         </w:tc>
         <w:tc>
           <w:tcPr>
@@ -9313,7 +9308,16 @@
               <w:right w:type="dxa" w:w="100"/>
             </w:tcMar>
           </w:tcPr>
-          <w:p/>
+          <w:p>
+            <w:r>
+              <w:rPr>
+                <w:rFonts w:ascii="Calibri" w:cs="Calibri" w:eastAsia="Calibri" w:hAnsi="Calibri"/>
+                <w:sz w:val="18"/>
+                <w:szCs w:val="18"/>
+              </w:rPr>
+              <w:t xml:space="preserve">1.00</w:t>
+            </w:r>
+          </w:p>
         </w:tc>
         <w:tc>
           <w:tcPr>
@@ -9331,7 +9335,16 @@
               <w:right w:type="dxa" w:w="100"/>
             </w:tcMar>
           </w:tcPr>
-          <w:p/>
+          <w:p>
+            <w:r>
+              <w:rPr>
+                <w:rFonts w:ascii="Calibri" w:cs="Calibri" w:eastAsia="Calibri" w:hAnsi="Calibri"/>
+                <w:sz w:val="18"/>
+                <w:szCs w:val="18"/>
+              </w:rPr>
+              <w:t xml:space="preserve">9.43</w:t>
+            </w:r>
+          </w:p>
         </w:tc>
       </w:tr>
       <w:tr>
@@ -9378,7 +9391,16 @@
               <w:right w:type="dxa" w:w="100"/>
             </w:tcMar>
           </w:tcPr>
-          <w:p/>
+          <w:p>
+            <w:r>
+              <w:rPr>
+                <w:rFonts w:ascii="Calibri" w:cs="Calibri" w:eastAsia="Calibri" w:hAnsi="Calibri"/>
+                <w:sz w:val="18"/>
+                <w:szCs w:val="18"/>
+              </w:rPr>
+              <w:t xml:space="preserve">204</w:t>
+            </w:r>
+          </w:p>
         </w:tc>
         <w:tc>
           <w:tcPr>
@@ -9396,7 +9418,16 @@
               <w:right w:type="dxa" w:w="100"/>
             </w:tcMar>
           </w:tcPr>
-          <w:p/>
+          <w:p>
+            <w:r>
+              <w:rPr>
+                <w:rFonts w:ascii="Calibri" w:cs="Calibri" w:eastAsia="Calibri" w:hAnsi="Calibri"/>
+                <w:sz w:val="18"/>
+                <w:szCs w:val="18"/>
+              </w:rPr>
+              <w:t xml:space="preserve">1339.3</w:t>
+            </w:r>
+          </w:p>
         </w:tc>
         <w:tc>
           <w:tcPr>
@@ -9414,7 +9445,16 @@
               <w:right w:type="dxa" w:w="100"/>
             </w:tcMar>
           </w:tcPr>
-          <w:p/>
+          <w:p>
+            <w:r>
+              <w:rPr>
+                <w:rFonts w:ascii="Calibri" w:cs="Calibri" w:eastAsia="Calibri" w:hAnsi="Calibri"/>
+                <w:sz w:val="18"/>
+                <w:szCs w:val="18"/>
+              </w:rPr>
+              <w:t xml:space="preserve">0.6867</w:t>
+            </w:r>
+          </w:p>
         </w:tc>
         <w:tc>
           <w:tcPr>
@@ -9432,7 +9472,16 @@
               <w:right w:type="dxa" w:w="100"/>
             </w:tcMar>
           </w:tcPr>
-          <w:p/>
+          <w:p>
+            <w:r>
+              <w:rPr>
+                <w:rFonts w:ascii="Calibri" w:cs="Calibri" w:eastAsia="Calibri" w:hAnsi="Calibri"/>
+                <w:sz w:val="18"/>
+                <w:szCs w:val="18"/>
+              </w:rPr>
+              <w:t xml:space="preserve">0.6035</w:t>
+            </w:r>
+          </w:p>
         </w:tc>
         <w:tc>
           <w:tcPr>
@@ -9450,7 +9499,16 @@
               <w:right w:type="dxa" w:w="100"/>
             </w:tcMar>
           </w:tcPr>
-          <w:p/>
+          <w:p>
+            <w:r>
+              <w:rPr>
+                <w:rFonts w:ascii="Calibri" w:cs="Calibri" w:eastAsia="Calibri" w:hAnsi="Calibri"/>
+                <w:sz w:val="18"/>
+                <w:szCs w:val="18"/>
+              </w:rPr>
+              <w:t xml:space="preserve">1.00</w:t>
+            </w:r>
+          </w:p>
         </w:tc>
         <w:tc>
           <w:tcPr>
@@ -9468,7 +9526,16 @@
               <w:right w:type="dxa" w:w="100"/>
             </w:tcMar>
           </w:tcPr>
-          <w:p/>
+          <w:p>
+            <w:r>
+              <w:rPr>
+                <w:rFonts w:ascii="Calibri" w:cs="Calibri" w:eastAsia="Calibri" w:hAnsi="Calibri"/>
+                <w:sz w:val="18"/>
+                <w:szCs w:val="18"/>
+              </w:rPr>
+              <w:t xml:space="preserve">4.60</w:t>
+            </w:r>
+          </w:p>
         </w:tc>
       </w:tr>
       <w:tr>
@@ -9515,7 +9582,16 @@
               <w:right w:type="dxa" w:w="100"/>
             </w:tcMar>
           </w:tcPr>
-          <w:p/>
+          <w:p>
+            <w:r>
+              <w:rPr>
+                <w:rFonts w:ascii="Calibri" w:cs="Calibri" w:eastAsia="Calibri" w:hAnsi="Calibri"/>
+                <w:sz w:val="18"/>
+                <w:szCs w:val="18"/>
+              </w:rPr>
+              <w:t xml:space="preserve">1706</w:t>
+            </w:r>
+          </w:p>
         </w:tc>
         <w:tc>
           <w:tcPr>
@@ -9533,7 +9609,16 @@
               <w:right w:type="dxa" w:w="100"/>
             </w:tcMar>
           </w:tcPr>
-          <w:p/>
+          <w:p>
+            <w:r>
+              <w:rPr>
+                <w:rFonts w:ascii="Calibri" w:cs="Calibri" w:eastAsia="Calibri" w:hAnsi="Calibri"/>
+                <w:sz w:val="18"/>
+                <w:szCs w:val="18"/>
+              </w:rPr>
+              <w:t xml:space="preserve">160.2</w:t>
+            </w:r>
+          </w:p>
         </w:tc>
         <w:tc>
           <w:tcPr>
@@ -9551,7 +9636,16 @@
               <w:right w:type="dxa" w:w="100"/>
             </w:tcMar>
           </w:tcPr>
-          <w:p/>
+          <w:p>
+            <w:r>
+              <w:rPr>
+                <w:rFonts w:ascii="Calibri" w:cs="Calibri" w:eastAsia="Calibri" w:hAnsi="Calibri"/>
+                <w:sz w:val="18"/>
+                <w:szCs w:val="18"/>
+              </w:rPr>
+              <w:t xml:space="preserve">0.7467</w:t>
+            </w:r>
+          </w:p>
         </w:tc>
         <w:tc>
           <w:tcPr>
@@ -9569,7 +9663,16 @@
               <w:right w:type="dxa" w:w="100"/>
             </w:tcMar>
           </w:tcPr>
-          <w:p/>
+          <w:p>
+            <w:r>
+              <w:rPr>
+                <w:rFonts w:ascii="Calibri" w:cs="Calibri" w:eastAsia="Calibri" w:hAnsi="Calibri"/>
+                <w:sz w:val="18"/>
+                <w:szCs w:val="18"/>
+              </w:rPr>
+              <w:t xml:space="preserve">0.6817</w:t>
+            </w:r>
+          </w:p>
         </w:tc>
         <w:tc>
           <w:tcPr>
@@ -9587,7 +9690,16 @@
               <w:right w:type="dxa" w:w="100"/>
             </w:tcMar>
           </w:tcPr>
-          <w:p/>
+          <w:p>
+            <w:r>
+              <w:rPr>
+                <w:rFonts w:ascii="Calibri" w:cs="Calibri" w:eastAsia="Calibri" w:hAnsi="Calibri"/>
+                <w:sz w:val="18"/>
+                <w:szCs w:val="18"/>
+              </w:rPr>
+              <w:t xml:space="preserve">0.80</w:t>
+            </w:r>
+          </w:p>
         </w:tc>
         <w:tc>
           <w:tcPr>
@@ -9605,7 +9717,16 @@
               <w:right w:type="dxa" w:w="100"/>
             </w:tcMar>
           </w:tcPr>
-          <w:p/>
+          <w:p>
+            <w:r>
+              <w:rPr>
+                <w:rFonts w:ascii="Calibri" w:cs="Calibri" w:eastAsia="Calibri" w:hAnsi="Calibri"/>
+                <w:sz w:val="18"/>
+                <w:szCs w:val="18"/>
+              </w:rPr>
+              <w:t xml:space="preserve">29.85</w:t>
+            </w:r>
+          </w:p>
         </w:tc>
       </w:tr>
     </w:tbl>
@@ -9613,23 +9734,6 @@
       <w:pPr>
         <w:spacing w:after="120"/>
       </w:pPr>
-    </w:p>
-    <w:p>
-      <w:pPr>
-        <w:spacing w:after="120" w:line="276"/>
-      </w:pPr>
-      <w:r>
-        <w:rPr>
-          <w:rFonts w:ascii="Calibri" w:cs="Calibri" w:eastAsia="Calibri" w:hAnsi="Calibri"/>
-          <w:b/>
-          <w:bCs/>
-          <w:sz w:val="21"/>
-          <w:szCs w:val="21"/>
-          <w:highlight w:val="yellow"/>
-          <w:highlightCs w:val="yellow"/>
-        </w:rPr>
-        <w:t xml:space="preserve">[TODO: copy the numbers from the generated table in reports/hw03/METRICS.md]</w:t>
-      </w:r>
     </w:p>
     <w:tbl>
       <w:tblPr>
@@ -9721,38 +9825,562 @@
         <w:t xml:space="preserve">2.7 A confidently scored retrieval that does not contain the answer</w:t>
       </w:r>
     </w:p>
+    <w:tbl>
+      <w:tblPr>
+        <w:tblW w:type="dxa" w:w="9360"/>
+        <w:tblBorders>
+          <w:top w:val="single" w:color="auto" w:sz="4"/>
+          <w:left w:val="single" w:color="auto" w:sz="4"/>
+          <w:bottom w:val="single" w:color="auto" w:sz="4"/>
+          <w:right w:val="single" w:color="auto" w:sz="4"/>
+          <w:insideH w:val="single" w:color="auto" w:sz="4"/>
+          <w:insideV w:val="single" w:color="auto" w:sz="4"/>
+        </w:tblBorders>
+      </w:tblPr>
+      <w:tblGrid>
+        <w:gridCol w:w="1300"/>
+        <w:gridCol w:w="800"/>
+        <w:gridCol w:w="600"/>
+        <w:gridCol w:w="800"/>
+        <w:gridCol w:w="2400"/>
+        <w:gridCol w:w="3460"/>
+      </w:tblGrid>
+      <w:tr>
+        <w:trPr>
+          <w:tblHeader/>
+        </w:trPr>
+        <w:tc>
+          <w:tcPr>
+            <w:tcW w:type="dxa" w:w="1300"/>
+            <w:tcBorders>
+              <w:top w:val="single" w:color="BFBFBF" w:sz="4"/>
+              <w:left w:val="single" w:color="BFBFBF" w:sz="4"/>
+              <w:bottom w:val="single" w:color="BFBFBF" w:sz="4"/>
+              <w:right w:val="single" w:color="BFBFBF" w:sz="4"/>
+            </w:tcBorders>
+            <w:shd w:fill="2E2E2E" w:color="auto" w:val="clear"/>
+            <w:tcMar>
+              <w:top w:type="dxa" w:w="60"/>
+              <w:left w:type="dxa" w:w="100"/>
+              <w:bottom w:type="dxa" w:w="60"/>
+              <w:right w:type="dxa" w:w="100"/>
+            </w:tcMar>
+          </w:tcPr>
+          <w:p>
+            <w:r>
+              <w:rPr>
+                <w:rFonts w:ascii="Calibri" w:cs="Calibri" w:eastAsia="Calibri" w:hAnsi="Calibri"/>
+                <w:b/>
+                <w:bCs/>
+                <w:color w:val="FFFFFF"/>
+                <w:sz w:val="18"/>
+                <w:szCs w:val="18"/>
+              </w:rPr>
+              <w:t xml:space="preserve">Technique</w:t>
+            </w:r>
+          </w:p>
+        </w:tc>
+        <w:tc>
+          <w:tcPr>
+            <w:tcW w:type="dxa" w:w="800"/>
+            <w:tcBorders>
+              <w:top w:val="single" w:color="BFBFBF" w:sz="4"/>
+              <w:left w:val="single" w:color="BFBFBF" w:sz="4"/>
+              <w:bottom w:val="single" w:color="BFBFBF" w:sz="4"/>
+              <w:right w:val="single" w:color="BFBFBF" w:sz="4"/>
+            </w:tcBorders>
+            <w:shd w:fill="2E2E2E" w:color="auto" w:val="clear"/>
+            <w:tcMar>
+              <w:top w:type="dxa" w:w="60"/>
+              <w:left w:type="dxa" w:w="100"/>
+              <w:bottom w:type="dxa" w:w="60"/>
+              <w:right w:type="dxa" w:w="100"/>
+            </w:tcMar>
+          </w:tcPr>
+          <w:p>
+            <w:r>
+              <w:rPr>
+                <w:rFonts w:ascii="Calibri" w:cs="Calibri" w:eastAsia="Calibri" w:hAnsi="Calibri"/>
+                <w:b/>
+                <w:bCs/>
+                <w:color w:val="FFFFFF"/>
+                <w:sz w:val="18"/>
+                <w:szCs w:val="18"/>
+              </w:rPr>
+              <w:t xml:space="preserve">Question</w:t>
+            </w:r>
+          </w:p>
+        </w:tc>
+        <w:tc>
+          <w:tcPr>
+            <w:tcW w:type="dxa" w:w="600"/>
+            <w:tcBorders>
+              <w:top w:val="single" w:color="BFBFBF" w:sz="4"/>
+              <w:left w:val="single" w:color="BFBFBF" w:sz="4"/>
+              <w:bottom w:val="single" w:color="BFBFBF" w:sz="4"/>
+              <w:right w:val="single" w:color="BFBFBF" w:sz="4"/>
+            </w:tcBorders>
+            <w:shd w:fill="2E2E2E" w:color="auto" w:val="clear"/>
+            <w:tcMar>
+              <w:top w:type="dxa" w:w="60"/>
+              <w:left w:type="dxa" w:w="100"/>
+              <w:bottom w:type="dxa" w:w="60"/>
+              <w:right w:type="dxa" w:w="100"/>
+            </w:tcMar>
+          </w:tcPr>
+          <w:p>
+            <w:r>
+              <w:rPr>
+                <w:rFonts w:ascii="Calibri" w:cs="Calibri" w:eastAsia="Calibri" w:hAnsi="Calibri"/>
+                <w:b/>
+                <w:bCs/>
+                <w:color w:val="FFFFFF"/>
+                <w:sz w:val="18"/>
+                <w:szCs w:val="18"/>
+              </w:rPr>
+              <w:t xml:space="preserve">Rank</w:t>
+            </w:r>
+          </w:p>
+        </w:tc>
+        <w:tc>
+          <w:tcPr>
+            <w:tcW w:type="dxa" w:w="800"/>
+            <w:tcBorders>
+              <w:top w:val="single" w:color="BFBFBF" w:sz="4"/>
+              <w:left w:val="single" w:color="BFBFBF" w:sz="4"/>
+              <w:bottom w:val="single" w:color="BFBFBF" w:sz="4"/>
+              <w:right w:val="single" w:color="BFBFBF" w:sz="4"/>
+            </w:tcBorders>
+            <w:shd w:fill="2E2E2E" w:color="auto" w:val="clear"/>
+            <w:tcMar>
+              <w:top w:type="dxa" w:w="60"/>
+              <w:left w:type="dxa" w:w="100"/>
+              <w:bottom w:type="dxa" w:w="60"/>
+              <w:right w:type="dxa" w:w="100"/>
+            </w:tcMar>
+          </w:tcPr>
+          <w:p>
+            <w:r>
+              <w:rPr>
+                <w:rFonts w:ascii="Calibri" w:cs="Calibri" w:eastAsia="Calibri" w:hAnsi="Calibri"/>
+                <w:b/>
+                <w:bCs/>
+                <w:color w:val="FFFFFF"/>
+                <w:sz w:val="18"/>
+                <w:szCs w:val="18"/>
+              </w:rPr>
+              <w:t xml:space="preserve">Cosine</w:t>
+            </w:r>
+          </w:p>
+        </w:tc>
+        <w:tc>
+          <w:tcPr>
+            <w:tcW w:type="dxa" w:w="2400"/>
+            <w:tcBorders>
+              <w:top w:val="single" w:color="BFBFBF" w:sz="4"/>
+              <w:left w:val="single" w:color="BFBFBF" w:sz="4"/>
+              <w:bottom w:val="single" w:color="BFBFBF" w:sz="4"/>
+              <w:right w:val="single" w:color="BFBFBF" w:sz="4"/>
+            </w:tcBorders>
+            <w:shd w:fill="2E2E2E" w:color="auto" w:val="clear"/>
+            <w:tcMar>
+              <w:top w:type="dxa" w:w="60"/>
+              <w:left w:type="dxa" w:w="100"/>
+              <w:bottom w:type="dxa" w:w="60"/>
+              <w:right w:type="dxa" w:w="100"/>
+            </w:tcMar>
+          </w:tcPr>
+          <w:p>
+            <w:r>
+              <w:rPr>
+                <w:rFonts w:ascii="Calibri" w:cs="Calibri" w:eastAsia="Calibri" w:hAnsi="Calibri"/>
+                <w:b/>
+                <w:bCs/>
+                <w:color w:val="FFFFFF"/>
+                <w:sz w:val="18"/>
+                <w:szCs w:val="18"/>
+              </w:rPr>
+              <w:t xml:space="preserve">Source file</w:t>
+            </w:r>
+          </w:p>
+        </w:tc>
+        <w:tc>
+          <w:tcPr>
+            <w:tcW w:type="dxa" w:w="3460"/>
+            <w:tcBorders>
+              <w:top w:val="single" w:color="BFBFBF" w:sz="4"/>
+              <w:left w:val="single" w:color="BFBFBF" w:sz="4"/>
+              <w:bottom w:val="single" w:color="BFBFBF" w:sz="4"/>
+              <w:right w:val="single" w:color="BFBFBF" w:sz="4"/>
+            </w:tcBorders>
+            <w:shd w:fill="2E2E2E" w:color="auto" w:val="clear"/>
+            <w:tcMar>
+              <w:top w:type="dxa" w:w="60"/>
+              <w:left w:type="dxa" w:w="100"/>
+              <w:bottom w:type="dxa" w:w="60"/>
+              <w:right w:type="dxa" w:w="100"/>
+            </w:tcMar>
+          </w:tcPr>
+          <w:p>
+            <w:r>
+              <w:rPr>
+                <w:rFonts w:ascii="Calibri" w:cs="Calibri" w:eastAsia="Calibri" w:hAnsi="Calibri"/>
+                <w:b/>
+                <w:bCs/>
+                <w:color w:val="FFFFFF"/>
+                <w:sz w:val="18"/>
+                <w:szCs w:val="18"/>
+              </w:rPr>
+              <w:t xml:space="preserve">Retrieved text</w:t>
+            </w:r>
+          </w:p>
+        </w:tc>
+      </w:tr>
+      <w:tr>
+        <w:tc>
+          <w:tcPr>
+            <w:tcW w:type="dxa" w:w="1300"/>
+            <w:tcBorders>
+              <w:top w:val="single" w:color="BFBFBF" w:sz="4"/>
+              <w:left w:val="single" w:color="BFBFBF" w:sz="4"/>
+              <w:bottom w:val="single" w:color="BFBFBF" w:sz="4"/>
+              <w:right w:val="single" w:color="BFBFBF" w:sz="4"/>
+            </w:tcBorders>
+            <w:tcMar>
+              <w:top w:type="dxa" w:w="60"/>
+              <w:left w:type="dxa" w:w="100"/>
+              <w:bottom w:type="dxa" w:w="60"/>
+              <w:right w:type="dxa" w:w="100"/>
+            </w:tcMar>
+          </w:tcPr>
+          <w:p>
+            <w:r>
+              <w:rPr>
+                <w:rFonts w:ascii="Calibri" w:cs="Calibri" w:eastAsia="Calibri" w:hAnsi="Calibri"/>
+                <w:sz w:val="18"/>
+                <w:szCs w:val="18"/>
+              </w:rPr>
+              <w:t xml:space="preserve">Sentence window</w:t>
+            </w:r>
+          </w:p>
+        </w:tc>
+        <w:tc>
+          <w:tcPr>
+            <w:tcW w:type="dxa" w:w="800"/>
+            <w:tcBorders>
+              <w:top w:val="single" w:color="BFBFBF" w:sz="4"/>
+              <w:left w:val="single" w:color="BFBFBF" w:sz="4"/>
+              <w:bottom w:val="single" w:color="BFBFBF" w:sz="4"/>
+              <w:right w:val="single" w:color="BFBFBF" w:sz="4"/>
+            </w:tcBorders>
+            <w:tcMar>
+              <w:top w:type="dxa" w:w="60"/>
+              <w:left w:type="dxa" w:w="100"/>
+              <w:bottom w:type="dxa" w:w="60"/>
+              <w:right w:type="dxa" w:w="100"/>
+            </w:tcMar>
+          </w:tcPr>
+          <w:p>
+            <w:r>
+              <w:rPr>
+                <w:rFonts w:ascii="Calibri" w:cs="Calibri" w:eastAsia="Calibri" w:hAnsi="Calibri"/>
+                <w:sz w:val="18"/>
+                <w:szCs w:val="18"/>
+              </w:rPr>
+              <w:t xml:space="preserve">q5</w:t>
+            </w:r>
+          </w:p>
+        </w:tc>
+        <w:tc>
+          <w:tcPr>
+            <w:tcW w:type="dxa" w:w="600"/>
+            <w:tcBorders>
+              <w:top w:val="single" w:color="BFBFBF" w:sz="4"/>
+              <w:left w:val="single" w:color="BFBFBF" w:sz="4"/>
+              <w:bottom w:val="single" w:color="BFBFBF" w:sz="4"/>
+              <w:right w:val="single" w:color="BFBFBF" w:sz="4"/>
+            </w:tcBorders>
+            <w:tcMar>
+              <w:top w:type="dxa" w:w="60"/>
+              <w:left w:type="dxa" w:w="100"/>
+              <w:bottom w:type="dxa" w:w="60"/>
+              <w:right w:type="dxa" w:w="100"/>
+            </w:tcMar>
+          </w:tcPr>
+          <w:p>
+            <w:r>
+              <w:rPr>
+                <w:rFonts w:ascii="Calibri" w:cs="Calibri" w:eastAsia="Calibri" w:hAnsi="Calibri"/>
+                <w:sz w:val="18"/>
+                <w:szCs w:val="18"/>
+              </w:rPr>
+              <w:t xml:space="preserve">1</w:t>
+            </w:r>
+          </w:p>
+        </w:tc>
+        <w:tc>
+          <w:tcPr>
+            <w:tcW w:type="dxa" w:w="800"/>
+            <w:tcBorders>
+              <w:top w:val="single" w:color="BFBFBF" w:sz="4"/>
+              <w:left w:val="single" w:color="BFBFBF" w:sz="4"/>
+              <w:bottom w:val="single" w:color="BFBFBF" w:sz="4"/>
+              <w:right w:val="single" w:color="BFBFBF" w:sz="4"/>
+            </w:tcBorders>
+            <w:tcMar>
+              <w:top w:type="dxa" w:w="60"/>
+              <w:left w:type="dxa" w:w="100"/>
+              <w:bottom w:type="dxa" w:w="60"/>
+              <w:right w:type="dxa" w:w="100"/>
+            </w:tcMar>
+          </w:tcPr>
+          <w:p>
+            <w:r>
+              <w:rPr>
+                <w:rFonts w:ascii="Calibri" w:cs="Calibri" w:eastAsia="Calibri" w:hAnsi="Calibri"/>
+                <w:sz w:val="18"/>
+                <w:szCs w:val="18"/>
+              </w:rPr>
+              <w:t xml:space="preserve">0.7301</w:t>
+            </w:r>
+          </w:p>
+        </w:tc>
+        <w:tc>
+          <w:tcPr>
+            <w:tcW w:type="dxa" w:w="2400"/>
+            <w:tcBorders>
+              <w:top w:val="single" w:color="BFBFBF" w:sz="4"/>
+              <w:left w:val="single" w:color="BFBFBF" w:sz="4"/>
+              <w:bottom w:val="single" w:color="BFBFBF" w:sz="4"/>
+              <w:right w:val="single" w:color="BFBFBF" w:sz="4"/>
+            </w:tcBorders>
+            <w:tcMar>
+              <w:top w:type="dxa" w:w="60"/>
+              <w:left w:type="dxa" w:w="100"/>
+              <w:bottom w:type="dxa" w:w="60"/>
+              <w:right w:type="dxa" w:w="100"/>
+            </w:tcMar>
+          </w:tcPr>
+          <w:p>
+            <w:r>
+              <w:rPr>
+                <w:rFonts w:ascii="Calibri" w:cs="Calibri" w:eastAsia="Calibri" w:hAnsi="Calibri"/>
+                <w:sz w:val="18"/>
+                <w:szCs w:val="18"/>
+              </w:rPr>
+              <w:t xml:space="preserve">fda_frito-lay-issues-voluntary-allergy-alert.txt</w:t>
+            </w:r>
+          </w:p>
+        </w:tc>
+        <w:tc>
+          <w:tcPr>
+            <w:tcW w:type="dxa" w:w="3460"/>
+            <w:tcBorders>
+              <w:top w:val="single" w:color="BFBFBF" w:sz="4"/>
+              <w:left w:val="single" w:color="BFBFBF" w:sz="4"/>
+              <w:bottom w:val="single" w:color="BFBFBF" w:sz="4"/>
+              <w:right w:val="single" w:color="BFBFBF" w:sz="4"/>
+            </w:tcBorders>
+            <w:tcMar>
+              <w:top w:type="dxa" w:w="60"/>
+              <w:left w:type="dxa" w:w="100"/>
+              <w:bottom w:type="dxa" w:w="60"/>
+              <w:right w:type="dxa" w:w="100"/>
+            </w:tcMar>
+          </w:tcPr>
+          <w:p>
+            <w:r>
+              <w:rPr>
+                <w:rFonts w:ascii="Calibri" w:cs="Calibri" w:eastAsia="Calibri" w:hAnsi="Calibri"/>
+                <w:sz w:val="18"/>
+                <w:szCs w:val="18"/>
+              </w:rPr>
+              <w:t xml:space="preserve">Those with an allergy or severe sensitivity to milk run the risk of a serious or life-threatening allergic reaction…</w:t>
+            </w:r>
+          </w:p>
+        </w:tc>
+      </w:tr>
+      <w:tr>
+        <w:tc>
+          <w:tcPr>
+            <w:tcW w:type="dxa" w:w="1300"/>
+            <w:tcBorders>
+              <w:top w:val="single" w:color="BFBFBF" w:sz="4"/>
+              <w:left w:val="single" w:color="BFBFBF" w:sz="4"/>
+              <w:bottom w:val="single" w:color="BFBFBF" w:sz="4"/>
+              <w:right w:val="single" w:color="BFBFBF" w:sz="4"/>
+            </w:tcBorders>
+            <w:tcMar>
+              <w:top w:type="dxa" w:w="60"/>
+              <w:left w:type="dxa" w:w="100"/>
+              <w:bottom w:type="dxa" w:w="60"/>
+              <w:right w:type="dxa" w:w="100"/>
+            </w:tcMar>
+          </w:tcPr>
+          <w:p>
+            <w:r>
+              <w:rPr>
+                <w:rFonts w:ascii="Calibri" w:cs="Calibri" w:eastAsia="Calibri" w:hAnsi="Calibri"/>
+                <w:sz w:val="18"/>
+                <w:szCs w:val="18"/>
+              </w:rPr>
+              <w:t xml:space="preserve">Sentence window</w:t>
+            </w:r>
+          </w:p>
+        </w:tc>
+        <w:tc>
+          <w:tcPr>
+            <w:tcW w:type="dxa" w:w="800"/>
+            <w:tcBorders>
+              <w:top w:val="single" w:color="BFBFBF" w:sz="4"/>
+              <w:left w:val="single" w:color="BFBFBF" w:sz="4"/>
+              <w:bottom w:val="single" w:color="BFBFBF" w:sz="4"/>
+              <w:right w:val="single" w:color="BFBFBF" w:sz="4"/>
+            </w:tcBorders>
+            <w:tcMar>
+              <w:top w:type="dxa" w:w="60"/>
+              <w:left w:type="dxa" w:w="100"/>
+              <w:bottom w:type="dxa" w:w="60"/>
+              <w:right w:type="dxa" w:w="100"/>
+            </w:tcMar>
+          </w:tcPr>
+          <w:p>
+            <w:r>
+              <w:rPr>
+                <w:rFonts w:ascii="Calibri" w:cs="Calibri" w:eastAsia="Calibri" w:hAnsi="Calibri"/>
+                <w:sz w:val="18"/>
+                <w:szCs w:val="18"/>
+              </w:rPr>
+              <w:t xml:space="preserve">q1</w:t>
+            </w:r>
+          </w:p>
+        </w:tc>
+        <w:tc>
+          <w:tcPr>
+            <w:tcW w:type="dxa" w:w="600"/>
+            <w:tcBorders>
+              <w:top w:val="single" w:color="BFBFBF" w:sz="4"/>
+              <w:left w:val="single" w:color="BFBFBF" w:sz="4"/>
+              <w:bottom w:val="single" w:color="BFBFBF" w:sz="4"/>
+              <w:right w:val="single" w:color="BFBFBF" w:sz="4"/>
+            </w:tcBorders>
+            <w:tcMar>
+              <w:top w:type="dxa" w:w="60"/>
+              <w:left w:type="dxa" w:w="100"/>
+              <w:bottom w:type="dxa" w:w="60"/>
+              <w:right w:type="dxa" w:w="100"/>
+            </w:tcMar>
+          </w:tcPr>
+          <w:p>
+            <w:r>
+              <w:rPr>
+                <w:rFonts w:ascii="Calibri" w:cs="Calibri" w:eastAsia="Calibri" w:hAnsi="Calibri"/>
+                <w:sz w:val="18"/>
+                <w:szCs w:val="18"/>
+              </w:rPr>
+              <w:t xml:space="preserve">1</w:t>
+            </w:r>
+          </w:p>
+        </w:tc>
+        <w:tc>
+          <w:tcPr>
+            <w:tcW w:type="dxa" w:w="800"/>
+            <w:tcBorders>
+              <w:top w:val="single" w:color="BFBFBF" w:sz="4"/>
+              <w:left w:val="single" w:color="BFBFBF" w:sz="4"/>
+              <w:bottom w:val="single" w:color="BFBFBF" w:sz="4"/>
+              <w:right w:val="single" w:color="BFBFBF" w:sz="4"/>
+            </w:tcBorders>
+            <w:tcMar>
+              <w:top w:type="dxa" w:w="60"/>
+              <w:left w:type="dxa" w:w="100"/>
+              <w:bottom w:type="dxa" w:w="60"/>
+              <w:right w:type="dxa" w:w="100"/>
+            </w:tcMar>
+          </w:tcPr>
+          <w:p>
+            <w:r>
+              <w:rPr>
+                <w:rFonts w:ascii="Calibri" w:cs="Calibri" w:eastAsia="Calibri" w:hAnsi="Calibri"/>
+                <w:sz w:val="18"/>
+                <w:szCs w:val="18"/>
+              </w:rPr>
+              <w:t xml:space="preserve">0.7979</w:t>
+            </w:r>
+          </w:p>
+        </w:tc>
+        <w:tc>
+          <w:tcPr>
+            <w:tcW w:type="dxa" w:w="2400"/>
+            <w:tcBorders>
+              <w:top w:val="single" w:color="BFBFBF" w:sz="4"/>
+              <w:left w:val="single" w:color="BFBFBF" w:sz="4"/>
+              <w:bottom w:val="single" w:color="BFBFBF" w:sz="4"/>
+              <w:right w:val="single" w:color="BFBFBF" w:sz="4"/>
+            </w:tcBorders>
+            <w:tcMar>
+              <w:top w:type="dxa" w:w="60"/>
+              <w:left w:type="dxa" w:w="100"/>
+              <w:bottom w:type="dxa" w:w="60"/>
+              <w:right w:type="dxa" w:w="100"/>
+            </w:tcMar>
+          </w:tcPr>
+          <w:p>
+            <w:r>
+              <w:rPr>
+                <w:rFonts w:ascii="Calibri" w:cs="Calibri" w:eastAsia="Calibri" w:hAnsi="Calibri"/>
+                <w:sz w:val="18"/>
+                <w:szCs w:val="18"/>
+              </w:rPr>
+              <w:t xml:space="preserve">ecfr_21cfr_part7.txt</w:t>
+            </w:r>
+          </w:p>
+        </w:tc>
+        <w:tc>
+          <w:tcPr>
+            <w:tcW w:type="dxa" w:w="3460"/>
+            <w:tcBorders>
+              <w:top w:val="single" w:color="BFBFBF" w:sz="4"/>
+              <w:left w:val="single" w:color="BFBFBF" w:sz="4"/>
+              <w:bottom w:val="single" w:color="BFBFBF" w:sz="4"/>
+              <w:right w:val="single" w:color="BFBFBF" w:sz="4"/>
+            </w:tcBorders>
+            <w:tcMar>
+              <w:top w:type="dxa" w:w="60"/>
+              <w:left w:type="dxa" w:w="100"/>
+              <w:bottom w:type="dxa" w:w="60"/>
+              <w:right w:type="dxa" w:w="100"/>
+            </w:tcMar>
+          </w:tcPr>
+          <w:p>
+            <w:r>
+              <w:rPr>
+                <w:rFonts w:ascii="Calibri" w:cs="Calibri" w:eastAsia="Calibri" w:hAnsi="Calibri"/>
+                <w:sz w:val="18"/>
+                <w:szCs w:val="18"/>
+              </w:rPr>
+              <w:t xml:space="preserve">(b) On the basis of this determination, the Food and Drug Administration will assign the recall a classification…</w:t>
+            </w:r>
+          </w:p>
+        </w:tc>
+      </w:tr>
+    </w:tbl>
     <w:p>
       <w:pPr>
         <w:spacing w:after="120"/>
       </w:pPr>
-      <w:r>
-        <w:rPr>
-          <w:rFonts w:ascii="Calibri" w:cs="Calibri" w:eastAsia="Calibri" w:hAnsi="Calibri"/>
-          <w:b/>
-          <w:bCs/>
-          <w:sz w:val="21"/>
-          <w:szCs w:val="21"/>
-          <w:highlight w:val="yellow"/>
-          <w:highlightCs w:val="yellow"/>
-        </w:rPr>
-        <w:t xml:space="preserve">[TODO: pick one row labelled “no” in annotations.csv with a high cosine: technique, question, rank, cosine, source file, preview]</w:t>
-      </w:r>
-    </w:p>
-    <w:p>
-      <w:pPr>
-        <w:spacing w:after="120"/>
-      </w:pPr>
-      <w:r>
-        <w:rPr>
-          <w:rFonts w:ascii="Calibri" w:cs="Calibri" w:eastAsia="Calibri" w:hAnsi="Calibri"/>
-          <w:b/>
-          <w:bCs/>
-          <w:sz w:val="21"/>
-          <w:szCs w:val="21"/>
-          <w:highlight w:val="yellow"/>
-          <w:highlightCs w:val="yellow"/>
-        </w:rPr>
-        <w:t xml:space="preserve">[TODO: explain why the embedding scored it high: shared template wording (“is voluntarily recalling…”, “undeclared milk”), same product words with a different hazard, or the question’s key term (e.g. cesium-137, cereulide) being rare to MiniLM so the vector is dominated by common words]</w:t>
+    </w:p>
+    <w:p>
+      <w:pPr>
+        <w:spacing w:after="120" w:line="276"/>
+      </w:pPr>
+      <w:r>
+        <w:rPr>
+          <w:rFonts w:ascii="Calibri" w:cs="Calibri" w:eastAsia="Calibri" w:hAnsi="Calibri"/>
+          <w:sz w:val="21"/>
+          <w:szCs w:val="21"/>
+        </w:rPr>
+        <w:t xml:space="preserve">Both rows are labelled “no” in annotations.csv. q5 asks which milk was recalled because of food-grade cleaning agents. The top result is an allergy warning from a Frito-Lay recall. It shares the words “milk” and “recall” with the question, and this sentence appears in many allergen notices, so its vector is close to the query. The words “cleaning agents” appear in only one document, and they do not pull the query vector enough. The q1 row comes from the right file and has the highest cosine of the whole run, but the sentence only says that FDA assigns a class. It does not say what Class II means.</w:t>
       </w:r>
     </w:p>
     <w:p>
@@ -9760,24 +10388,72 @@
         <w:pStyle w:val="Heading2"/>
       </w:pPr>
       <w:r>
-        <w:t xml:space="preserve">2.8 Observations</w:t>
-      </w:r>
-    </w:p>
-    <w:p>
-      <w:pPr>
-        <w:spacing w:after="120"/>
-      </w:pPr>
-      <w:r>
-        <w:rPr>
-          <w:rFonts w:ascii="Calibri" w:cs="Calibri" w:eastAsia="Calibri" w:hAnsi="Calibri"/>
-          <w:b/>
-          <w:bCs/>
-          <w:sz w:val="21"/>
-          <w:szCs w:val="21"/>
-          <w:highlight w:val="yellow"/>
-          <w:highlightCs w:val="yellow"/>
-        </w:rPr>
-        <w:t xml:space="preserve">[TODO: 1–2 short paragraphs: why one technique did better on these questions — sentence coherence, semantic boundary detection, token-budget alignment (long semantic chunks are cut at 256 word pieces by MiniLM), context carried by the sentence window. Mention whether the best technique differs between the regulation questions (q1, q2) and the announcement questions (q3–q5).]</w:t>
+        <w:t xml:space="preserve">2.8 Analysis</w:t>
+      </w:r>
+    </w:p>
+    <w:p>
+      <w:pPr>
+        <w:spacing w:after="120" w:line="276"/>
+      </w:pPr>
+      <w:r>
+        <w:rPr>
+          <w:rFonts w:ascii="Calibri" w:cs="Calibri" w:eastAsia="Calibri" w:hAnsi="Calibri"/>
+          <w:sz w:val="21"/>
+          <w:szCs w:val="21"/>
+        </w:rPr>
+        <w:t xml:space="preserve">Token chunking worked best overall in my test. It found the right source file for all 5 questions (Recall@5 = 1.00), and its Mean@5 cosine was 0.649.</w:t>
+      </w:r>
+    </w:p>
+    <w:p>
+      <w:pPr>
+        <w:spacing w:after="120" w:line="276"/>
+      </w:pPr>
+      <w:r>
+        <w:rPr>
+          <w:rFonts w:ascii="Calibri" w:cs="Calibri" w:eastAsia="Calibri" w:hAnsi="Calibri"/>
+          <w:sz w:val="21"/>
+          <w:szCs w:val="21"/>
+        </w:rPr>
+        <w:t xml:space="preserve">Sentence-window got the highest top-1 cosine (0.747), but its recall was the lowest (0.80). It missed q5 completely. For q5 (the milk with cleaning agents), all 5 results were from other recalls, for example a sentence about people with a milk allergy. For q1, the top 2 results were from the right file (21 CFR Part 7), but they did not have the Class II definition in them. So a high cosine score does not always mean the answer is there. A short sentence with common words like “milk” or “recall” can get a high score even if it does not answer the question.</w:t>
+      </w:r>
+    </w:p>
+    <w:p>
+      <w:pPr>
+        <w:spacing w:after="120" w:line="276"/>
+      </w:pPr>
+      <w:r>
+        <w:rPr>
+          <w:rFonts w:ascii="Calibri" w:cs="Calibri" w:eastAsia="Calibri" w:hAnsi="Calibri"/>
+          <w:sz w:val="21"/>
+          <w:szCs w:val="21"/>
+        </w:rPr>
+        <w:t xml:space="preserve">Semantic chunking also found the right file for all 5 questions (Recall@5 = 1.00), but its top-1 cosine was the lowest (0.687). Its chunk sizes were very uneven. The longest chunk had 11,491 characters, which is much longer than what MiniLM can read (about 256 word pieces), so most of that chunk was cut off when it was embedded. Some other chunks were only one short sentence, like “This recall is being conducted in cooperation with the FDA.” One of these was ranked first for q1 even though it had no useful information.</w:t>
+      </w:r>
+    </w:p>
+    <w:p>
+      <w:pPr>
+        <w:spacing w:after="120" w:line="276"/>
+      </w:pPr>
+      <w:r>
+        <w:rPr>
+          <w:rFonts w:ascii="Calibri" w:cs="Calibri" w:eastAsia="Calibri" w:hAnsi="Calibri"/>
+          <w:sz w:val="21"/>
+          <w:szCs w:val="21"/>
+        </w:rPr>
+        <w:t xml:space="preserve">The best technique was not the same for every question. On q5, semantic chunking ranked the correct document first, and sentence-window failed. On q1 and q2, sentence-window gave the highest scores.</w:t>
+      </w:r>
+    </w:p>
+    <w:p>
+      <w:pPr>
+        <w:spacing w:after="120" w:line="276"/>
+      </w:pPr>
+      <w:r>
+        <w:rPr>
+          <w:rFonts w:ascii="Calibri" w:cs="Calibri" w:eastAsia="Calibri" w:hAnsi="Calibri"/>
+          <w:sz w:val="21"/>
+          <w:szCs w:val="21"/>
+        </w:rPr>
+        <w:t xml:space="preserve">Sentence-window was also the slowest (29.85 ms per search), because it made the most chunks (1,706).</w:t>
       </w:r>
     </w:p>
     <w:p>
@@ -9790,19 +10466,15 @@
     </w:p>
     <w:p>
       <w:pPr>
-        <w:spacing w:after="120"/>
-      </w:pPr>
-      <w:r>
-        <w:rPr>
-          <w:rFonts w:ascii="Calibri" w:cs="Calibri" w:eastAsia="Calibri" w:hAnsi="Calibri"/>
-          <w:b/>
-          <w:bCs/>
-          <w:sz w:val="21"/>
-          <w:szCs w:val="21"/>
-          <w:highlight w:val="yellow"/>
-          <w:highlightCs w:val="yellow"/>
-        </w:rPr>
-        <w:t xml:space="preserve">[TODO: 2–5 sentences: which technique is best for this corpus and why, citing the numbers in 2.6]</w:t>
+        <w:spacing w:after="120" w:line="276"/>
+      </w:pPr>
+      <w:r>
+        <w:rPr>
+          <w:rFonts w:ascii="Calibri" w:cs="Calibri" w:eastAsia="Calibri" w:hAnsi="Calibri"/>
+          <w:sz w:val="21"/>
+          <w:szCs w:val="21"/>
+        </w:rPr>
+        <w:t xml:space="preserve">For this corpus, I think token chunking is the best choice. It had perfect recall, and its chunks were a similar size, so each chunk kept enough context. I also learned that cosine similarity alone is not a good way to judge retrieval. It is better to check whether the retrieved chunks really contain the answer.</w:t>
       </w:r>
     </w:p>
     <w:p>
@@ -10188,7 +10860,33 @@
     </w:p>
     <w:p>
       <w:pPr>
-        <w:spacing w:after="120"/>
+        <w:spacing w:after="120" w:line="276"/>
+      </w:pPr>
+      <w:r>
+        <w:rPr>
+          <w:rFonts w:ascii="Calibri" w:cs="Calibri" w:eastAsia="Calibri" w:hAnsi="Calibri"/>
+          <w:sz w:val="21"/>
+          <w:szCs w:val="21"/>
+        </w:rPr>
+        <w:t xml:space="preserve">I did the design and the checking myself. I decided to use a mixed corpus (FDA recall announcements plus 21 CFR Part 7) instead of only openFDA JSON records, because each record is shorter than one chunk and the three chunkers would give almost the same result. I also decided where the corpus is stored, that the raw output is split into two files, that recall is computed from questions.yaml instead of stored, that sentence-window is measured on the single sentence, that annotations go in a separate file, and that HW2 code stays unchanged. I reviewed and approved the five questions and committed them before the retrieval run. I ran all the code on my own computer, labelled annotations.csv by reading the retrieved chunks, took the screenshots, and wrote the first draft of the analysis and conclusion.</w:t>
+      </w:r>
+    </w:p>
+    <w:p>
+      <w:pPr>
+        <w:spacing w:after="120" w:line="276"/>
+      </w:pPr>
+      <w:r>
+        <w:rPr>
+          <w:rFonts w:ascii="Calibri" w:cs="Calibri" w:eastAsia="Calibri" w:hAnsi="Calibri"/>
+          <w:sz w:val="21"/>
+          <w:szCs w:val="21"/>
+        </w:rPr>
+        <w:t xml:space="preserve">I used Claude to explain the assignment and put the steps in order. It found the FDA and eCFR source pages and collected the list of 89 recall announcement URLs. It wrote the code based on my design decisions: the changes to the instructor's auth starter, the fetch, chunking and summary scripts, verify_hw03.py and the Makefile targets. It drafted questions.yaml for me to review, helped debug problems, made the report template, and made the wording of my analysis simpler.</w:t>
+      </w:r>
+    </w:p>
+    <w:p>
+      <w:pPr>
+        <w:spacing w:after="60" w:before="160"/>
       </w:pPr>
       <w:r>
         <w:rPr>
@@ -10197,10 +10895,21 @@
           <w:bCs/>
           <w:sz w:val="21"/>
           <w:szCs w:val="21"/>
-          <w:highlight w:val="yellow"/>
-          <w:highlightCs w:val="yellow"/>
-        </w:rPr>
-        <w:t xml:space="preserve">[TODO: your answer]</w:t>
+        </w:rPr>
+        <w:t xml:space="preserve">2. One AI output that was wrong</w:t>
+      </w:r>
+    </w:p>
+    <w:p>
+      <w:pPr>
+        <w:spacing w:after="120" w:line="276"/>
+      </w:pPr>
+      <w:r>
+        <w:rPr>
+          <w:rFonts w:ascii="Calibri" w:cs="Calibri" w:eastAsia="Calibri" w:hAnsi="Calibri"/>
+          <w:sz w:val="21"/>
+          <w:szCs w:val="21"/>
+        </w:rPr>
+        <w:t xml:space="preserve">The first version of rag_fetch_corpus.py used Python's built-in html.parser. Some FDA pages have broken HTML (a &lt;div&gt; inside a &lt;p&gt;). Because of this, the parser put the whole announcement inside the first paragraph, and the script saved only the title and the summary box. It also skipped tables.</w:t>
       </w:r>
     </w:p>
     <w:p>
@@ -10215,12 +10924,25 @@
           <w:sz w:val="21"/>
           <w:szCs w:val="21"/>
         </w:rPr>
-        <w:t xml:space="preserve">2. One AI-produced output that was wrong or unsuitable, or one thing I verified independently</w:t>
-      </w:r>
-    </w:p>
-    <w:p>
-      <w:pPr>
-        <w:spacing w:after="120"/>
+        <w:t xml:space="preserve">3. How the problem was found</w:t>
+      </w:r>
+    </w:p>
+    <w:p>
+      <w:pPr>
+        <w:spacing w:after="120" w:line="276"/>
+      </w:pPr>
+      <w:r>
+        <w:rPr>
+          <w:rFonts w:ascii="Calibri" w:cs="Calibri" w:eastAsia="Calibri" w:hAnsi="Calibri"/>
+          <w:sz w:val="21"/>
+          <w:szCs w:val="21"/>
+        </w:rPr>
+        <w:t xml:space="preserve">After the first download, the corpus was 227,584 bytes. I sorted the files by size, and the smallest ones were only about 500 bytes. When I opened fda_ambriola-company-issues-recall-cheese-products.txt, it had only the title and summary, but the web page has several paragraphs and two tables of expiration dates.</w:t>
+      </w:r>
+    </w:p>
+    <w:p>
+      <w:pPr>
+        <w:spacing w:after="60" w:before="160"/>
       </w:pPr>
       <w:r>
         <w:rPr>
@@ -10229,74 +10951,21 @@
           <w:bCs/>
           <w:sz w:val="21"/>
           <w:szCs w:val="21"/>
-          <w:highlight w:val="yellow"/>
-          <w:highlightCs w:val="yellow"/>
-        </w:rPr>
-        <w:t xml:space="preserve">[TODO: your answer]</w:t>
-      </w:r>
-    </w:p>
-    <w:p>
-      <w:pPr>
-        <w:spacing w:after="60" w:before="160"/>
-      </w:pPr>
-      <w:r>
-        <w:rPr>
-          <w:rFonts w:ascii="Calibri" w:cs="Calibri" w:eastAsia="Calibri" w:hAnsi="Calibri"/>
-          <w:b/>
-          <w:bCs/>
-          <w:sz w:val="21"/>
-          <w:szCs w:val="21"/>
-        </w:rPr>
-        <w:t xml:space="preserve">3. How I detected the problem or verified the result</w:t>
-      </w:r>
-    </w:p>
-    <w:p>
-      <w:pPr>
-        <w:spacing w:after="120"/>
-      </w:pPr>
-      <w:r>
-        <w:rPr>
-          <w:rFonts w:ascii="Calibri" w:cs="Calibri" w:eastAsia="Calibri" w:hAnsi="Calibri"/>
-          <w:b/>
-          <w:bCs/>
-          <w:sz w:val="21"/>
-          <w:szCs w:val="21"/>
-          <w:highlight w:val="yellow"/>
-          <w:highlightCs w:val="yellow"/>
-        </w:rPr>
-        <w:t xml:space="preserve">[TODO: your answer]</w:t>
-      </w:r>
-    </w:p>
-    <w:p>
-      <w:pPr>
-        <w:spacing w:after="60" w:before="160"/>
-      </w:pPr>
-      <w:r>
-        <w:rPr>
-          <w:rFonts w:ascii="Calibri" w:cs="Calibri" w:eastAsia="Calibri" w:hAnsi="Calibri"/>
-          <w:b/>
-          <w:bCs/>
-          <w:sz w:val="21"/>
-          <w:szCs w:val="21"/>
-        </w:rPr>
-        <w:t xml:space="preserve">4. What I changed and why it works now</w:t>
-      </w:r>
-    </w:p>
-    <w:p>
-      <w:pPr>
-        <w:spacing w:after="120"/>
-      </w:pPr>
-      <w:r>
-        <w:rPr>
-          <w:rFonts w:ascii="Calibri" w:cs="Calibri" w:eastAsia="Calibri" w:hAnsi="Calibri"/>
-          <w:b/>
-          <w:bCs/>
-          <w:sz w:val="21"/>
-          <w:szCs w:val="21"/>
-          <w:highlight w:val="yellow"/>
-          <w:highlightCs w:val="yellow"/>
-        </w:rPr>
-        <w:t xml:space="preserve">[TODO: your answer]</w:t>
+        </w:rPr>
+        <w:t xml:space="preserve">4. What was changed and why it works now</w:t>
+      </w:r>
+    </w:p>
+    <w:p>
+      <w:pPr>
+        <w:spacing w:after="120" w:line="276"/>
+      </w:pPr>
+      <w:r>
+        <w:rPr>
+          <w:rFonts w:ascii="Calibri" w:cs="Calibri" w:eastAsia="Calibri" w:hAnsi="Calibri"/>
+          <w:sz w:val="21"/>
+          <w:szCs w:val="21"/>
+        </w:rPr>
+        <w:t xml:space="preserve">The script now uses the lxml parser, which fixes broken HTML the same way a browser does, and reads every paragraph, list item and table row in page order. After running it again, the corpus is 274,233 bytes, the smallest file is 1.4 KB, and the Ambriola file has the full text and both tables. I also checked that the answer to each of the five questions appears in its expected source file.</w:t>
       </w:r>
     </w:p>
     <w:sectPr>

</xml_diff>